<commit_message>
modify CAMI brand word files
</commit_message>
<xml_diff>
--- a/assets/Partners/CAMI/CAMI - New Askir 36BR/ASKIR 36BR.docx
+++ b/assets/Partners/CAMI/CAMI - New Askir 36BR/ASKIR 36BR.docx
@@ -1,6 +1,6 @@
 
 <file path=word/document.xml><?xml version="1.0" encoding="utf-8"?>
-<w:document xmlns:wpc="http://schemas.microsoft.com/office/word/2010/wordprocessingCanvas" xmlns:cx="http://schemas.microsoft.com/office/drawing/2014/chartex" xmlns:cx1="http://schemas.microsoft.com/office/drawing/2015/9/8/chartex" xmlns:cx2="http://schemas.microsoft.com/office/drawing/2015/10/21/chartex" xmlns:cx3="http://schemas.microsoft.com/office/drawing/2016/5/9/chartex" xmlns:cx4="http://schemas.microsoft.com/office/drawing/2016/5/10/chartex" xmlns:cx5="http://schemas.microsoft.com/office/drawing/2016/5/11/chartex" xmlns:cx6="http://schemas.microsoft.com/office/drawing/2016/5/12/chartex" xmlns:cx7="http://schemas.microsoft.com/office/drawing/2016/5/13/chartex" xmlns:cx8="http://schemas.microsoft.com/office/drawing/2016/5/14/chartex" xmlns:mc="http://schemas.openxmlformats.org/markup-compatibility/2006" xmlns:aink="http://schemas.microsoft.com/office/drawing/2016/ink" xmlns:am3d="http://schemas.microsoft.com/office/drawing/2017/model3d" xmlns:o="urn:schemas-microsoft-com:office:office" xmlns:oel="http://schemas.microsoft.com/office/2019/extlst" xmlns:r="http://schemas.openxmlformats.org/officeDocument/2006/relationships" xmlns:m="http://schemas.openxmlformats.org/officeDocument/2006/math" xmlns:v="urn:schemas-microsoft-com:vml" xmlns:wp14="http://schemas.microsoft.com/office/word/2010/wordprocessingDrawing" xmlns:wp="http://schemas.openxmlformats.org/drawingml/2006/wordprocessingDrawing" xmlns:w10="urn:schemas-microsoft-com:office:word" xmlns:w="http://schemas.openxmlformats.org/wordprocessingml/2006/main" xmlns:w14="http://schemas.microsoft.com/office/word/2010/wordml" xmlns:w15="http://schemas.microsoft.com/office/word/2012/wordml" xmlns:w16cex="http://schemas.microsoft.com/office/word/2018/wordml/cex" xmlns:w16cid="http://schemas.microsoft.com/office/word/2016/wordml/cid" xmlns:w16="http://schemas.microsoft.com/office/word/2018/wordml" xmlns:w16du="http://schemas.microsoft.com/office/word/2023/wordml/word16du" xmlns:w16sdtdh="http://schemas.microsoft.com/office/word/2020/wordml/sdtdatahash" xmlns:w16sdtfl="http://schemas.microsoft.com/office/word/2024/wordml/sdtformatlock" xmlns:w16se="http://schemas.microsoft.com/office/word/2015/wordml/symex" xmlns:wpg="http://schemas.microsoft.com/office/word/2010/wordprocessingGroup" xmlns:wpi="http://schemas.microsoft.com/office/word/2010/wordprocessingInk" xmlns:wne="http://schemas.microsoft.com/office/word/2006/wordml" xmlns:wps="http://schemas.microsoft.com/office/word/2010/wordprocessingShape" mc:Ignorable="w14 w15 w16se w16cid w16 w16cex w16sdtdh w16sdtfl w16du wp14">
+<w:document xmlns:wpc="http://schemas.microsoft.com/office/word/2010/wordprocessingCanvas" xmlns:cx="http://schemas.microsoft.com/office/drawing/2014/chartex" xmlns:cx1="http://schemas.microsoft.com/office/drawing/2015/9/8/chartex" xmlns:cx2="http://schemas.microsoft.com/office/drawing/2015/10/21/chartex" xmlns:cx3="http://schemas.microsoft.com/office/drawing/2016/5/9/chartex" xmlns:cx4="http://schemas.microsoft.com/office/drawing/2016/5/10/chartex" xmlns:cx5="http://schemas.microsoft.com/office/drawing/2016/5/11/chartex" xmlns:cx6="http://schemas.microsoft.com/office/drawing/2016/5/12/chartex" xmlns:cx7="http://schemas.microsoft.com/office/drawing/2016/5/13/chartex" xmlns:cx8="http://schemas.microsoft.com/office/drawing/2016/5/14/chartex" xmlns:mc="http://schemas.openxmlformats.org/markup-compatibility/2006" xmlns:aink="http://schemas.microsoft.com/office/drawing/2016/ink" xmlns:am3d="http://schemas.microsoft.com/office/drawing/2017/model3d" xmlns:o="urn:schemas-microsoft-com:office:office" xmlns:r="http://schemas.openxmlformats.org/officeDocument/2006/relationships" xmlns:m="http://schemas.openxmlformats.org/officeDocument/2006/math" xmlns:v="urn:schemas-microsoft-com:vml" xmlns:wp14="http://schemas.microsoft.com/office/word/2010/wordprocessingDrawing" xmlns:wp="http://schemas.openxmlformats.org/drawingml/2006/wordprocessingDrawing" xmlns:w10="urn:schemas-microsoft-com:office:word" xmlns:w="http://schemas.openxmlformats.org/wordprocessingml/2006/main" xmlns:w14="http://schemas.microsoft.com/office/word/2010/wordml" xmlns:w15="http://schemas.microsoft.com/office/word/2012/wordml" xmlns:w16cid="http://schemas.microsoft.com/office/word/2016/wordml/cid" xmlns:w16se="http://schemas.microsoft.com/office/word/2015/wordml/symex" xmlns:wpg="http://schemas.microsoft.com/office/word/2010/wordprocessingGroup" xmlns:wpi="http://schemas.microsoft.com/office/word/2010/wordprocessingInk" xmlns:wne="http://schemas.microsoft.com/office/word/2006/wordml" xmlns:wps="http://schemas.microsoft.com/office/word/2010/wordprocessingShape" mc:Ignorable="w14 w15 w16se w16cid wp14">
   <w:body>
     <w:p>
       <w:pPr>
@@ -37,7 +37,6 @@
         <w:bidi w:val="0"/>
         <w:jc w:val="left"/>
         <w:rPr>
-          <w:rFonts w:hint="cs"/>
           <w:rtl/>
         </w:rPr>
       </w:pPr>
@@ -138,7 +137,7 @@
           <w:bCs/>
         </w:rPr>
         <w:pict w14:anchorId="7950130A">
-          <v:rect id="_x0000_i1065" style="width:0;height:1.5pt" o:hralign="center" o:hrstd="t" o:hr="t" fillcolor="#a0a0a0" stroked="f"/>
+          <v:rect id="_x0000_i1025" style="width:0;height:1.5pt" o:hralign="center" o:hrstd="t" o:hr="t" fillcolor="#a0a0a0" stroked="f"/>
         </w:pict>
       </w:r>
     </w:p>
@@ -304,7 +303,7 @@
           <w:bCs/>
         </w:rPr>
         <w:pict w14:anchorId="0FF76976">
-          <v:rect id="_x0000_i1066" style="width:0;height:1.5pt" o:hralign="center" o:hrstd="t" o:hr="t" fillcolor="#a0a0a0" stroked="f"/>
+          <v:rect id="_x0000_i1026" style="width:0;height:1.5pt" o:hralign="center" o:hrstd="t" o:hr="t" fillcolor="#a0a0a0" stroked="f"/>
         </w:pict>
       </w:r>
     </w:p>
@@ -465,7 +464,7 @@
           <w:bCs/>
         </w:rPr>
         <w:pict w14:anchorId="21958D0A">
-          <v:rect id="_x0000_i1067" style="width:0;height:1.5pt" o:hralign="center" o:hrstd="t" o:hr="t" fillcolor="#a0a0a0" stroked="f"/>
+          <v:rect id="_x0000_i1027" style="width:0;height:1.5pt" o:hralign="center" o:hrstd="t" o:hr="t" fillcolor="#a0a0a0" stroked="f"/>
         </w:pict>
       </w:r>
     </w:p>
@@ -817,7 +816,7 @@
           <w:bCs/>
         </w:rPr>
         <w:pict w14:anchorId="015082D1">
-          <v:rect id="_x0000_i1068" style="width:0;height:1.5pt" o:hralign="center" o:hrstd="t" o:hr="t" fillcolor="#a0a0a0" stroked="f"/>
+          <v:rect id="_x0000_i1028" style="width:0;height:1.5pt" o:hralign="center" o:hrstd="t" o:hr="t" fillcolor="#a0a0a0" stroked="f"/>
         </w:pict>
       </w:r>
     </w:p>
@@ -829,336 +828,8 @@
           <w:bCs/>
         </w:rPr>
       </w:pPr>
-      <w:r>
-        <w:rPr>
-          <w:bCs/>
-        </w:rPr>
-        <w:t>NEW ASKIR 36 Li-ION (Proximity)</w:t>
-      </w:r>
-    </w:p>
-    <w:p>
-      <w:pPr>
-        <w:numPr>
-          <w:ilvl w:val="0"/>
-          <w:numId w:val="22"/>
-        </w:numPr>
-        <w:bidi w:val="0"/>
-        <w:jc w:val="left"/>
-        <w:rPr>
-          <w:bCs/>
-        </w:rPr>
-      </w:pPr>
-      <w:r>
-        <w:rPr>
-          <w:bCs/>
-        </w:rPr>
-        <w:t xml:space="preserve">Motor: Oil-less, maintenance-free piston pump </w:t>
-      </w:r>
-    </w:p>
-    <w:p>
-      <w:pPr>
-        <w:numPr>
-          <w:ilvl w:val="0"/>
-          <w:numId w:val="22"/>
-        </w:numPr>
-        <w:bidi w:val="0"/>
-        <w:jc w:val="left"/>
-        <w:rPr>
-          <w:bCs/>
-        </w:rPr>
-      </w:pPr>
-      <w:r>
-        <w:rPr>
-          <w:bCs/>
-        </w:rPr>
-        <w:t xml:space="preserve">Power Feeding: </w:t>
-      </w:r>
-    </w:p>
-    <w:p>
-      <w:pPr>
-        <w:numPr>
-          <w:ilvl w:val="1"/>
-          <w:numId w:val="22"/>
-        </w:numPr>
-        <w:bidi w:val="0"/>
-        <w:jc w:val="left"/>
-        <w:rPr>
-          <w:bCs/>
-        </w:rPr>
-      </w:pPr>
-      <w:r>
-        <w:rPr>
-          <w:bCs/>
-        </w:rPr>
-        <w:t xml:space="preserve">14V (4A 100–240V~) </w:t>
-      </w:r>
-    </w:p>
-    <w:p>
-      <w:pPr>
-        <w:numPr>
-          <w:ilvl w:val="1"/>
-          <w:numId w:val="22"/>
-        </w:numPr>
-        <w:bidi w:val="0"/>
-        <w:jc w:val="left"/>
-        <w:rPr>
-          <w:bCs/>
-        </w:rPr>
-      </w:pPr>
-      <w:r>
-        <w:rPr>
-          <w:bCs/>
-        </w:rPr>
-        <w:t xml:space="preserve">50–60Hz AC/DC adapter </w:t>
-      </w:r>
-    </w:p>
-    <w:p>
-      <w:pPr>
-        <w:numPr>
-          <w:ilvl w:val="1"/>
-          <w:numId w:val="22"/>
-        </w:numPr>
-        <w:bidi w:val="0"/>
-        <w:jc w:val="left"/>
-        <w:rPr>
-          <w:bCs/>
-        </w:rPr>
-      </w:pPr>
-      <w:r>
-        <w:rPr>
-          <w:bCs/>
-        </w:rPr>
-        <w:t>12V car adapter</w:t>
-      </w:r>
-    </w:p>
-    <w:p>
-      <w:pPr>
-        <w:numPr>
-          <w:ilvl w:val="0"/>
-          <w:numId w:val="22"/>
-        </w:numPr>
-        <w:bidi w:val="0"/>
-        <w:jc w:val="left"/>
-        <w:rPr>
-          <w:bCs/>
-        </w:rPr>
-      </w:pPr>
-      <w:r>
-        <w:rPr>
-          <w:bCs/>
-        </w:rPr>
-        <w:t>Battery: 14.8V – 5.2A Li-ion rechargeable (autonomy up to 70 min, charging time ~6 hours)</w:t>
-      </w:r>
-    </w:p>
-    <w:p>
-      <w:pPr>
-        <w:numPr>
-          <w:ilvl w:val="0"/>
-          <w:numId w:val="22"/>
-        </w:numPr>
-        <w:bidi w:val="0"/>
-        <w:jc w:val="left"/>
-        <w:rPr>
-          <w:bCs/>
-        </w:rPr>
-      </w:pPr>
-      <w:r>
-        <w:rPr>
-          <w:bCs/>
-        </w:rPr>
-        <w:t>ON/OFF: Soft-touch + Proximity sensor</w:t>
-      </w:r>
-    </w:p>
-    <w:p>
-      <w:pPr>
-        <w:numPr>
-          <w:ilvl w:val="0"/>
-          <w:numId w:val="22"/>
-        </w:numPr>
-        <w:bidi w:val="0"/>
-        <w:jc w:val="left"/>
-        <w:rPr>
-          <w:bCs/>
-        </w:rPr>
-      </w:pPr>
-      <w:r>
-        <w:rPr>
-          <w:bCs/>
-        </w:rPr>
-        <w:t>Classification: High Vacuum / High Flow</w:t>
-      </w:r>
-    </w:p>
-    <w:p>
-      <w:pPr>
-        <w:numPr>
-          <w:ilvl w:val="0"/>
-          <w:numId w:val="22"/>
-        </w:numPr>
-        <w:bidi w:val="0"/>
-        <w:jc w:val="left"/>
-        <w:rPr>
-          <w:bCs/>
-        </w:rPr>
-      </w:pPr>
-      <w:r>
-        <w:rPr>
-          <w:bCs/>
-        </w:rPr>
-        <w:t>IP Code: IP21</w:t>
-      </w:r>
-    </w:p>
-    <w:p>
-      <w:pPr>
-        <w:numPr>
-          <w:ilvl w:val="0"/>
-          <w:numId w:val="22"/>
-        </w:numPr>
-        <w:bidi w:val="0"/>
-        <w:jc w:val="left"/>
-        <w:rPr>
-          <w:bCs/>
-        </w:rPr>
-      </w:pPr>
-      <w:r>
-        <w:rPr>
-          <w:bCs/>
-        </w:rPr>
-        <w:lastRenderedPageBreak/>
-        <w:t>Max Vacuum (adjustable): -0.80 bar / -80 kPa / -600 mmHg</w:t>
-      </w:r>
-    </w:p>
-    <w:p>
-      <w:pPr>
-        <w:numPr>
-          <w:ilvl w:val="0"/>
-          <w:numId w:val="22"/>
-        </w:numPr>
-        <w:bidi w:val="0"/>
-        <w:jc w:val="left"/>
-        <w:rPr>
-          <w:bCs/>
-        </w:rPr>
-      </w:pPr>
-      <w:r>
-        <w:rPr>
-          <w:bCs/>
-        </w:rPr>
-        <w:t>Max Air Flow: 36 L/min</w:t>
-      </w:r>
-    </w:p>
-    <w:p>
-      <w:pPr>
-        <w:numPr>
-          <w:ilvl w:val="0"/>
-          <w:numId w:val="22"/>
-        </w:numPr>
-        <w:bidi w:val="0"/>
-        <w:jc w:val="left"/>
-        <w:rPr>
-          <w:bCs/>
-        </w:rPr>
-      </w:pPr>
-      <w:r>
-        <w:rPr>
-          <w:bCs/>
-        </w:rPr>
-        <w:t>Noise Level: 60 dB(A)</w:t>
-      </w:r>
-    </w:p>
-    <w:p>
-      <w:pPr>
-        <w:numPr>
-          <w:ilvl w:val="0"/>
-          <w:numId w:val="22"/>
-        </w:numPr>
-        <w:bidi w:val="0"/>
-        <w:jc w:val="left"/>
-        <w:rPr>
-          <w:bCs/>
-        </w:rPr>
-      </w:pPr>
-      <w:r>
-        <w:rPr>
-          <w:bCs/>
-        </w:rPr>
-        <w:t>Duty Cycle: Non-stop operation (by mains only)</w:t>
-      </w:r>
-    </w:p>
-    <w:p>
-      <w:pPr>
-        <w:numPr>
-          <w:ilvl w:val="0"/>
-          <w:numId w:val="22"/>
-        </w:numPr>
-        <w:bidi w:val="0"/>
-        <w:jc w:val="left"/>
-        <w:rPr>
-          <w:bCs/>
-        </w:rPr>
-      </w:pPr>
-      <w:r>
-        <w:rPr>
-          <w:bCs/>
-        </w:rPr>
-        <w:t>Weight: 3.00 kg</w:t>
-      </w:r>
-    </w:p>
-    <w:p>
-      <w:pPr>
-        <w:numPr>
-          <w:ilvl w:val="0"/>
-          <w:numId w:val="22"/>
-        </w:numPr>
-        <w:bidi w:val="0"/>
-        <w:jc w:val="left"/>
-        <w:rPr>
-          <w:bCs/>
-        </w:rPr>
-      </w:pPr>
-      <w:r>
-        <w:rPr>
-          <w:bCs/>
-        </w:rPr>
-        <w:t>Dimensions: 35 × 21 × 18 cm</w:t>
-      </w:r>
-    </w:p>
-    <w:p>
-      <w:pPr>
-        <w:numPr>
-          <w:ilvl w:val="0"/>
-          <w:numId w:val="22"/>
-        </w:numPr>
-        <w:bidi w:val="0"/>
-        <w:jc w:val="left"/>
-        <w:rPr>
-          <w:bCs/>
-        </w:rPr>
-      </w:pPr>
-      <w:r>
-        <w:rPr>
-          <w:bCs/>
-        </w:rPr>
-        <w:t>Warranty: 2 years</w:t>
-      </w:r>
-    </w:p>
-    <w:p>
-      <w:pPr>
-        <w:numPr>
-          <w:ilvl w:val="0"/>
-          <w:numId w:val="22"/>
-        </w:numPr>
-        <w:bidi w:val="0"/>
-        <w:jc w:val="left"/>
-        <w:rPr>
-          <w:bCs/>
-        </w:rPr>
-      </w:pPr>
-      <w:r>
-        <w:rPr>
-          <w:bCs/>
-        </w:rPr>
-        <w:t>Manufacturing: Italy</w:t>
-      </w:r>
+      <w:bookmarkStart w:id="0" w:name="_GoBack"/>
+      <w:bookmarkEnd w:id="0"/>
     </w:p>
     <w:sectPr>
       <w:pgSz w:w="12240" w:h="15840"/>
@@ -1171,7 +842,7 @@
 </file>
 
 <file path=word/numbering.xml><?xml version="1.0" encoding="utf-8"?>
-<w:numbering xmlns:wpc="http://schemas.microsoft.com/office/word/2010/wordprocessingCanvas" xmlns:cx="http://schemas.microsoft.com/office/drawing/2014/chartex" xmlns:cx1="http://schemas.microsoft.com/office/drawing/2015/9/8/chartex" xmlns:cx2="http://schemas.microsoft.com/office/drawing/2015/10/21/chartex" xmlns:cx3="http://schemas.microsoft.com/office/drawing/2016/5/9/chartex" xmlns:cx4="http://schemas.microsoft.com/office/drawing/2016/5/10/chartex" xmlns:cx5="http://schemas.microsoft.com/office/drawing/2016/5/11/chartex" xmlns:cx6="http://schemas.microsoft.com/office/drawing/2016/5/12/chartex" xmlns:cx7="http://schemas.microsoft.com/office/drawing/2016/5/13/chartex" xmlns:cx8="http://schemas.microsoft.com/office/drawing/2016/5/14/chartex" xmlns:mc="http://schemas.openxmlformats.org/markup-compatibility/2006" xmlns:aink="http://schemas.microsoft.com/office/drawing/2016/ink" xmlns:am3d="http://schemas.microsoft.com/office/drawing/2017/model3d" xmlns:o="urn:schemas-microsoft-com:office:office" xmlns:oel="http://schemas.microsoft.com/office/2019/extlst" xmlns:r="http://schemas.openxmlformats.org/officeDocument/2006/relationships" xmlns:m="http://schemas.openxmlformats.org/officeDocument/2006/math" xmlns:v="urn:schemas-microsoft-com:vml" xmlns:wp14="http://schemas.microsoft.com/office/word/2010/wordprocessingDrawing" xmlns:wp="http://schemas.openxmlformats.org/drawingml/2006/wordprocessingDrawing" xmlns:w10="urn:schemas-microsoft-com:office:word" xmlns:w="http://schemas.openxmlformats.org/wordprocessingml/2006/main" xmlns:w14="http://schemas.microsoft.com/office/word/2010/wordml" xmlns:w15="http://schemas.microsoft.com/office/word/2012/wordml" xmlns:w16cex="http://schemas.microsoft.com/office/word/2018/wordml/cex" xmlns:w16cid="http://schemas.microsoft.com/office/word/2016/wordml/cid" xmlns:w16="http://schemas.microsoft.com/office/word/2018/wordml" xmlns:w16du="http://schemas.microsoft.com/office/word/2023/wordml/word16du" xmlns:w16sdtdh="http://schemas.microsoft.com/office/word/2020/wordml/sdtdatahash" xmlns:w16sdtfl="http://schemas.microsoft.com/office/word/2024/wordml/sdtformatlock" xmlns:w16se="http://schemas.microsoft.com/office/word/2015/wordml/symex" xmlns:wpg="http://schemas.microsoft.com/office/word/2010/wordprocessingGroup" xmlns:wpi="http://schemas.microsoft.com/office/word/2010/wordprocessingInk" xmlns:wne="http://schemas.microsoft.com/office/word/2006/wordml" xmlns:wps="http://schemas.microsoft.com/office/word/2010/wordprocessingShape" mc:Ignorable="w14 w15 w16se w16cid w16 w16cex w16sdtdh w16sdtfl w16du wp14">
+<w:numbering xmlns:wpc="http://schemas.microsoft.com/office/word/2010/wordprocessingCanvas" xmlns:cx="http://schemas.microsoft.com/office/drawing/2014/chartex" xmlns:cx1="http://schemas.microsoft.com/office/drawing/2015/9/8/chartex" xmlns:cx2="http://schemas.microsoft.com/office/drawing/2015/10/21/chartex" xmlns:cx3="http://schemas.microsoft.com/office/drawing/2016/5/9/chartex" xmlns:cx4="http://schemas.microsoft.com/office/drawing/2016/5/10/chartex" xmlns:cx5="http://schemas.microsoft.com/office/drawing/2016/5/11/chartex" xmlns:cx6="http://schemas.microsoft.com/office/drawing/2016/5/12/chartex" xmlns:cx7="http://schemas.microsoft.com/office/drawing/2016/5/13/chartex" xmlns:cx8="http://schemas.microsoft.com/office/drawing/2016/5/14/chartex" xmlns:mc="http://schemas.openxmlformats.org/markup-compatibility/2006" xmlns:aink="http://schemas.microsoft.com/office/drawing/2016/ink" xmlns:am3d="http://schemas.microsoft.com/office/drawing/2017/model3d" xmlns:o="urn:schemas-microsoft-com:office:office" xmlns:r="http://schemas.openxmlformats.org/officeDocument/2006/relationships" xmlns:m="http://schemas.openxmlformats.org/officeDocument/2006/math" xmlns:v="urn:schemas-microsoft-com:vml" xmlns:wp14="http://schemas.microsoft.com/office/word/2010/wordprocessingDrawing" xmlns:wp="http://schemas.openxmlformats.org/drawingml/2006/wordprocessingDrawing" xmlns:w10="urn:schemas-microsoft-com:office:word" xmlns:w="http://schemas.openxmlformats.org/wordprocessingml/2006/main" xmlns:w14="http://schemas.microsoft.com/office/word/2010/wordml" xmlns:w15="http://schemas.microsoft.com/office/word/2012/wordml" xmlns:w16cid="http://schemas.microsoft.com/office/word/2016/wordml/cid" xmlns:w16se="http://schemas.microsoft.com/office/word/2015/wordml/symex" xmlns:wpg="http://schemas.microsoft.com/office/word/2010/wordprocessingGroup" xmlns:wpi="http://schemas.microsoft.com/office/word/2010/wordprocessingInk" xmlns:wne="http://schemas.microsoft.com/office/word/2006/wordml" xmlns:wps="http://schemas.microsoft.com/office/word/2010/wordprocessingShape" mc:Ignorable="w14 w15 w16se w16cid wp14">
   <w:abstractNum w:abstractNumId="0" w15:restartNumberingAfterBreak="0">
     <w:nsid w:val="086E05A3"/>
     <w:multiLevelType w:val="multilevel"/>
@@ -4562,80 +4233,80 @@
       </w:rPr>
     </w:lvl>
   </w:abstractNum>
-  <w:num w:numId="1" w16cid:durableId="194781471">
+  <w:num w:numId="1">
     <w:abstractNumId w:val="14"/>
   </w:num>
-  <w:num w:numId="2" w16cid:durableId="818501226">
+  <w:num w:numId="2">
     <w:abstractNumId w:val="15"/>
   </w:num>
-  <w:num w:numId="3" w16cid:durableId="426510884">
+  <w:num w:numId="3">
     <w:abstractNumId w:val="17"/>
   </w:num>
-  <w:num w:numId="4" w16cid:durableId="855775313">
+  <w:num w:numId="4">
     <w:abstractNumId w:val="5"/>
   </w:num>
-  <w:num w:numId="5" w16cid:durableId="1464805809">
+  <w:num w:numId="5">
     <w:abstractNumId w:val="8"/>
   </w:num>
-  <w:num w:numId="6" w16cid:durableId="90778446">
+  <w:num w:numId="6">
     <w:abstractNumId w:val="9"/>
   </w:num>
-  <w:num w:numId="7" w16cid:durableId="1631666986">
+  <w:num w:numId="7">
     <w:abstractNumId w:val="22"/>
   </w:num>
-  <w:num w:numId="8" w16cid:durableId="343750556">
+  <w:num w:numId="8">
     <w:abstractNumId w:val="6"/>
   </w:num>
-  <w:num w:numId="9" w16cid:durableId="2094088539">
+  <w:num w:numId="9">
     <w:abstractNumId w:val="19"/>
   </w:num>
-  <w:num w:numId="10" w16cid:durableId="1566451545">
+  <w:num w:numId="10">
     <w:abstractNumId w:val="4"/>
   </w:num>
-  <w:num w:numId="11" w16cid:durableId="69353682">
+  <w:num w:numId="11">
     <w:abstractNumId w:val="1"/>
   </w:num>
-  <w:num w:numId="12" w16cid:durableId="1639873690">
+  <w:num w:numId="12">
     <w:abstractNumId w:val="0"/>
   </w:num>
-  <w:num w:numId="13" w16cid:durableId="826016149">
+  <w:num w:numId="13">
     <w:abstractNumId w:val="21"/>
   </w:num>
-  <w:num w:numId="14" w16cid:durableId="1201162176">
+  <w:num w:numId="14">
     <w:abstractNumId w:val="13"/>
   </w:num>
-  <w:num w:numId="15" w16cid:durableId="1898779675">
+  <w:num w:numId="15">
     <w:abstractNumId w:val="11"/>
   </w:num>
-  <w:num w:numId="16" w16cid:durableId="782652839">
+  <w:num w:numId="16">
     <w:abstractNumId w:val="16"/>
   </w:num>
-  <w:num w:numId="17" w16cid:durableId="33586175">
+  <w:num w:numId="17">
     <w:abstractNumId w:val="2"/>
   </w:num>
-  <w:num w:numId="18" w16cid:durableId="1255287908">
+  <w:num w:numId="18">
     <w:abstractNumId w:val="18"/>
   </w:num>
-  <w:num w:numId="19" w16cid:durableId="1625647509">
+  <w:num w:numId="19">
     <w:abstractNumId w:val="7"/>
   </w:num>
-  <w:num w:numId="20" w16cid:durableId="586571722">
+  <w:num w:numId="20">
     <w:abstractNumId w:val="10"/>
   </w:num>
-  <w:num w:numId="21" w16cid:durableId="269317434">
+  <w:num w:numId="21">
     <w:abstractNumId w:val="3"/>
   </w:num>
-  <w:num w:numId="22" w16cid:durableId="1366173079">
+  <w:num w:numId="22">
     <w:abstractNumId w:val="20"/>
   </w:num>
-  <w:num w:numId="23" w16cid:durableId="1821269640">
+  <w:num w:numId="23">
     <w:abstractNumId w:val="12"/>
   </w:num>
 </w:numbering>
 </file>
 
 <file path=word/styles.xml><?xml version="1.0" encoding="utf-8"?>
-<w:styles xmlns:mc="http://schemas.openxmlformats.org/markup-compatibility/2006" xmlns:r="http://schemas.openxmlformats.org/officeDocument/2006/relationships" xmlns:w="http://schemas.openxmlformats.org/wordprocessingml/2006/main" xmlns:w14="http://schemas.microsoft.com/office/word/2010/wordml" xmlns:w15="http://schemas.microsoft.com/office/word/2012/wordml" xmlns:w16cex="http://schemas.microsoft.com/office/word/2018/wordml/cex" xmlns:w16cid="http://schemas.microsoft.com/office/word/2016/wordml/cid" xmlns:w16="http://schemas.microsoft.com/office/word/2018/wordml" xmlns:w16du="http://schemas.microsoft.com/office/word/2023/wordml/word16du" xmlns:w16sdtdh="http://schemas.microsoft.com/office/word/2020/wordml/sdtdatahash" xmlns:w16sdtfl="http://schemas.microsoft.com/office/word/2024/wordml/sdtformatlock" xmlns:w16se="http://schemas.microsoft.com/office/word/2015/wordml/symex" mc:Ignorable="w14 w15 w16se w16cid w16 w16cex w16sdtdh w16sdtfl w16du">
+<w:styles xmlns:mc="http://schemas.openxmlformats.org/markup-compatibility/2006" xmlns:r="http://schemas.openxmlformats.org/officeDocument/2006/relationships" xmlns:w="http://schemas.openxmlformats.org/wordprocessingml/2006/main" xmlns:w14="http://schemas.microsoft.com/office/word/2010/wordml" xmlns:w15="http://schemas.microsoft.com/office/word/2012/wordml" xmlns:w16cid="http://schemas.microsoft.com/office/word/2016/wordml/cid" xmlns:w16se="http://schemas.microsoft.com/office/word/2015/wordml/symex" mc:Ignorable="w14 w15 w16se w16cid">
   <w:docDefaults>
     <w:rPrDefault>
       <w:rPr>
@@ -4655,7 +4326,7 @@
       </w:pPr>
     </w:pPrDefault>
   </w:docDefaults>
-  <w:latentStyles w:defLockedState="0" w:defUIPriority="99" w:defSemiHidden="0" w:defUnhideWhenUsed="0" w:defQFormat="0" w:count="376">
+  <w:latentStyles w:defLockedState="0" w:defUIPriority="99" w:defSemiHidden="0" w:defUnhideWhenUsed="0" w:defQFormat="0" w:count="375">
     <w:lsdException w:name="Normal" w:uiPriority="0" w:qFormat="1"/>
     <w:lsdException w:name="heading 1" w:uiPriority="9" w:qFormat="1"/>
     <w:lsdException w:name="heading 2" w:semiHidden="1" w:uiPriority="9" w:unhideWhenUsed="1" w:qFormat="1"/>
@@ -5031,7 +4702,6 @@
     <w:lsdException w:name="Smart Hyperlink" w:semiHidden="1" w:unhideWhenUsed="1"/>
     <w:lsdException w:name="Hashtag" w:semiHidden="1" w:unhideWhenUsed="1"/>
     <w:lsdException w:name="Unresolved Mention" w:semiHidden="1" w:unhideWhenUsed="1"/>
-    <w:lsdException w:name="Smart Link" w:semiHidden="1" w:unhideWhenUsed="1"/>
   </w:latentStyles>
   <w:style w:type="paragraph" w:default="1" w:styleId="Normal">
     <w:name w:val="Normal"/>
@@ -5241,6 +4911,7 @@
   <w:style w:type="character" w:default="1" w:styleId="DefaultParagraphFont">
     <w:name w:val="Default Paragraph Font"/>
     <w:uiPriority w:val="1"/>
+    <w:semiHidden/>
     <w:unhideWhenUsed/>
   </w:style>
   <w:style w:type="table" w:default="1" w:styleId="TableNormal">

</xml_diff>